<commit_message>
Se actualiza el formato de asistencia de salidas academicas y el informe final de la practica de estudiantes
</commit_message>
<xml_diff>
--- a/public/docs/formato_02_informe_final_practica_estudiantes.docx
+++ b/public/docs/formato_02_informe_final_practica_estudiantes.docx
@@ -1,20 +1,7 @@
 
 <file path=word/document.xml><?xml version="1.0" encoding="utf-8"?>
-<w:document xmlns:wpc="http://schemas.microsoft.com/office/word/2010/wordprocessingCanvas" xmlns:cx="http://schemas.microsoft.com/office/drawing/2014/chartex" xmlns:cx1="http://schemas.microsoft.com/office/drawing/2015/9/8/chartex" xmlns:cx2="http://schemas.microsoft.com/office/drawing/2015/10/21/chartex" xmlns:cx3="http://schemas.microsoft.com/office/drawing/2016/5/9/chartex" xmlns:cx4="http://schemas.microsoft.com/office/drawing/2016/5/10/chartex" xmlns:cx5="http://schemas.microsoft.com/office/drawing/2016/5/11/chartex" xmlns:cx6="http://schemas.microsoft.com/office/drawing/2016/5/12/chartex" xmlns:cx7="http://schemas.microsoft.com/office/drawing/2016/5/13/chartex" xmlns:cx8="http://schemas.microsoft.com/office/drawing/2016/5/14/chartex" xmlns:mc="http://schemas.openxmlformats.org/markup-compatibility/2006" xmlns:aink="http://schemas.microsoft.com/office/drawing/2016/ink" xmlns:am3d="http://schemas.microsoft.com/office/drawing/2017/model3d" xmlns:o="urn:schemas-microsoft-com:office:office" xmlns:oel="http://schemas.microsoft.com/office/2019/extlst" xmlns:r="http://schemas.openxmlformats.org/officeDocument/2006/relationships" xmlns:m="http://schemas.openxmlformats.org/officeDocument/2006/math" xmlns:v="urn:schemas-microsoft-com:vml" xmlns:wp14="http://schemas.microsoft.com/office/word/2010/wordprocessingDrawing" xmlns:wp="http://schemas.openxmlformats.org/drawingml/2006/wordprocessingDrawing" xmlns:w10="urn:schemas-microsoft-com:office:word" xmlns:w="http://schemas.openxmlformats.org/wordprocessingml/2006/main" xmlns:w14="http://schemas.microsoft.com/office/word/2010/wordml" xmlns:w15="http://schemas.microsoft.com/office/word/2012/wordml" xmlns:w16cei="http://schemas.microsoft.com/office/word/2026/wordml/cei" xmlns:w16cex="http://schemas.microsoft.com/office/word/2018/wordml/cex" xmlns:w16cid="http://schemas.microsoft.com/office/word/2016/wordml/cid" xmlns:w16="http://schemas.microsoft.com/office/word/2018/wordml" xmlns:w16du="http://schemas.microsoft.com/office/word/2023/wordml/word16du" xmlns:w16sdtdh="http://schemas.microsoft.com/office/word/2020/wordml/sdtdatahash" xmlns:w16sdtfl="http://schemas.microsoft.com/office/word/2024/wordml/sdtformatlock" xmlns:w16se="http://schemas.microsoft.com/office/word/2015/wordml/symex" xmlns:wpg="http://schemas.microsoft.com/office/word/2010/wordprocessingGroup" xmlns:wpi="http://schemas.microsoft.com/office/word/2010/wordprocessingInk" xmlns:wne="http://schemas.microsoft.com/office/word/2006/wordml" xmlns:wps="http://schemas.microsoft.com/office/word/2010/wordprocessingShape" mc:Ignorable="w14 w15 w16se w16cid w16 w16cex w16sdtdh w16sdtfl w16du wp14">
+<w:document xmlns:wpc="http://schemas.microsoft.com/office/word/2010/wordprocessingCanvas" xmlns:cx="http://schemas.microsoft.com/office/drawing/2014/chartex" xmlns:cx1="http://schemas.microsoft.com/office/drawing/2015/9/8/chartex" xmlns:cx2="http://schemas.microsoft.com/office/drawing/2015/10/21/chartex" xmlns:cx3="http://schemas.microsoft.com/office/drawing/2016/5/9/chartex" xmlns:cx4="http://schemas.microsoft.com/office/drawing/2016/5/10/chartex" xmlns:cx5="http://schemas.microsoft.com/office/drawing/2016/5/11/chartex" xmlns:cx6="http://schemas.microsoft.com/office/drawing/2016/5/12/chartex" xmlns:cx7="http://schemas.microsoft.com/office/drawing/2016/5/13/chartex" xmlns:cx8="http://schemas.microsoft.com/office/drawing/2016/5/14/chartex" xmlns:mc="http://schemas.openxmlformats.org/markup-compatibility/2006" xmlns:aink="http://schemas.microsoft.com/office/drawing/2016/ink" xmlns:am3d="http://schemas.microsoft.com/office/drawing/2017/model3d" xmlns:o="urn:schemas-microsoft-com:office:office" xmlns:oel="http://schemas.microsoft.com/office/2019/extlst" xmlns:r="http://schemas.openxmlformats.org/officeDocument/2006/relationships" xmlns:m="http://schemas.openxmlformats.org/officeDocument/2006/math" xmlns:v="urn:schemas-microsoft-com:vml" xmlns:wp14="http://schemas.microsoft.com/office/word/2010/wordprocessingDrawing" xmlns:wp="http://schemas.openxmlformats.org/drawingml/2006/wordprocessingDrawing" xmlns:w10="urn:schemas-microsoft-com:office:word" xmlns:w="http://schemas.openxmlformats.org/wordprocessingml/2006/main" xmlns:w14="http://schemas.microsoft.com/office/word/2010/wordml" xmlns:w15="http://schemas.microsoft.com/office/word/2012/wordml" xmlns:w16cex="http://schemas.microsoft.com/office/word/2018/wordml/cex" xmlns:w16cid="http://schemas.microsoft.com/office/word/2016/wordml/cid" xmlns:w16="http://schemas.microsoft.com/office/word/2018/wordml" xmlns:w16du="http://schemas.microsoft.com/office/word/2023/wordml/word16du" xmlns:w16sdtdh="http://schemas.microsoft.com/office/word/2020/wordml/sdtdatahash" xmlns:w16sdtfl="http://schemas.microsoft.com/office/word/2024/wordml/sdtformatlock" xmlns:w16se="http://schemas.microsoft.com/office/word/2015/wordml/symex" xmlns:wpg="http://schemas.microsoft.com/office/word/2010/wordprocessingGroup" xmlns:wpi="http://schemas.microsoft.com/office/word/2010/wordprocessingInk" xmlns:wne="http://schemas.microsoft.com/office/word/2006/wordml" xmlns:wps="http://schemas.microsoft.com/office/word/2010/wordprocessingShape" mc:Ignorable="w14 w15 w16se w16cid w16 w16cex w16sdtdh w16sdtfl w16du wp14">
   <w:body>
-    <w:p>
-      <w:pPr>
-        <w:jc w:val="center"/>
-        <w:rPr>
-          <w:rFonts w:asciiTheme="majorHAnsi" w:hAnsiTheme="majorHAnsi" w:cstheme="majorHAnsi"/>
-          <w:b/>
-          <w:bCs/>
-          <w:sz w:val="28"/>
-          <w:szCs w:val="28"/>
-          <w:lang w:val="es-CO"/>
-        </w:rPr>
-      </w:pPr>
-    </w:p>
     <w:p>
       <w:pPr>
         <w:jc w:val="center"/>
@@ -755,418 +742,6 @@
         <w:t>Evidencias (productos, informes, piezas gráficas, etc.)</w:t>
       </w:r>
     </w:p>
-    <w:p>
-      <w:pPr>
-        <w:spacing w:line="240" w:lineRule="auto"/>
-        <w:jc w:val="both"/>
-        <w:rPr>
-          <w:rFonts w:ascii="Calibri" w:hAnsi="Calibri" w:cs="Calibri"/>
-          <w:sz w:val="24"/>
-          <w:szCs w:val="24"/>
-          <w:lang w:val="es-CO"/>
-        </w:rPr>
-      </w:pPr>
-    </w:p>
-    <w:p>
-      <w:pPr>
-        <w:spacing w:line="240" w:lineRule="auto"/>
-        <w:jc w:val="both"/>
-        <w:rPr>
-          <w:rFonts w:ascii="Calibri" w:hAnsi="Calibri" w:cs="Calibri"/>
-          <w:sz w:val="24"/>
-          <w:szCs w:val="24"/>
-          <w:lang w:val="es-CO"/>
-        </w:rPr>
-      </w:pPr>
-    </w:p>
-    <w:p>
-      <w:pPr>
-        <w:spacing w:line="240" w:lineRule="auto"/>
-        <w:jc w:val="both"/>
-        <w:rPr>
-          <w:rFonts w:ascii="Calibri" w:hAnsi="Calibri" w:cs="Calibri"/>
-          <w:sz w:val="24"/>
-          <w:szCs w:val="24"/>
-          <w:lang w:val="es-CO"/>
-        </w:rPr>
-      </w:pPr>
-    </w:p>
-    <w:p>
-      <w:pPr>
-        <w:spacing w:line="240" w:lineRule="auto"/>
-        <w:jc w:val="both"/>
-        <w:rPr>
-          <w:rFonts w:ascii="Calibri" w:hAnsi="Calibri" w:cs="Calibri"/>
-          <w:b/>
-          <w:bCs/>
-          <w:sz w:val="24"/>
-          <w:szCs w:val="24"/>
-          <w:lang w:val="es-CO"/>
-        </w:rPr>
-      </w:pPr>
-      <w:r>
-        <w:rPr>
-          <w:rFonts w:ascii="Calibri" w:hAnsi="Calibri" w:cs="Calibri"/>
-          <w:b/>
-          <w:bCs/>
-          <w:sz w:val="24"/>
-          <w:szCs w:val="24"/>
-          <w:lang w:val="es-CO"/>
-        </w:rPr>
-        <w:t>PERFIL DEL EGRESADO DE PUBLICIDAD</w:t>
-      </w:r>
-    </w:p>
-    <w:p>
-      <w:pPr>
-        <w:spacing w:line="240" w:lineRule="auto"/>
-        <w:jc w:val="both"/>
-        <w:rPr>
-          <w:rFonts w:ascii="Calibri" w:hAnsi="Calibri" w:cs="Calibri"/>
-          <w:sz w:val="24"/>
-          <w:szCs w:val="24"/>
-          <w:lang w:val="es-CO"/>
-        </w:rPr>
-      </w:pPr>
-      <w:r>
-        <w:rPr>
-          <w:rFonts w:ascii="Calibri" w:hAnsi="Calibri" w:cs="Calibri"/>
-          <w:b/>
-          <w:bCs/>
-          <w:sz w:val="24"/>
-          <w:szCs w:val="24"/>
-          <w:lang w:val="es-CO"/>
-        </w:rPr>
-        <w:t>E</w:t>
-      </w:r>
-      <w:r>
-        <w:rPr>
-          <w:rFonts w:ascii="Calibri" w:hAnsi="Calibri" w:cs="Calibri"/>
-          <w:b/>
-          <w:bCs/>
-          <w:sz w:val="24"/>
-          <w:szCs w:val="24"/>
-          <w:lang w:val="es-CO"/>
-        </w:rPr>
-        <w:t>l profesional en Publicidad tendrá el siguiente perfil en términos de competencias:</w:t>
-      </w:r>
-    </w:p>
-    <w:p>
-      <w:pPr>
-        <w:spacing w:line="240" w:lineRule="auto"/>
-        <w:jc w:val="both"/>
-        <w:rPr>
-          <w:rFonts w:ascii="Calibri" w:hAnsi="Calibri" w:cs="Calibri"/>
-          <w:sz w:val="24"/>
-          <w:szCs w:val="24"/>
-          <w:lang w:val="es-CO"/>
-        </w:rPr>
-      </w:pPr>
-      <w:r>
-        <w:rPr>
-          <w:rFonts w:ascii="Calibri" w:hAnsi="Calibri" w:cs="Calibri"/>
-          <w:sz w:val="24"/>
-          <w:szCs w:val="24"/>
-          <w:lang w:val="es-CO"/>
-        </w:rPr>
-        <w:t>El Publicista Creativo: es un sujeto crítico que sabe comprender y confrontar un contexto, que requiere imaginación, razonamiento lógico, apropiación de diferentes lenguajes y manejo de la información para brindar soluciones innovadoras a problemas de comunicación de las organizaciones y las necesidades de la sociedad en general, a través de medios tradicionales o alternativos. Para el publicista santiaguino, la creatividad es un insumo vital para generar procesos de diferenciación en los contextos sociales por donde circulan las marcas, los servicios y las ideas.</w:t>
-      </w:r>
-    </w:p>
-    <w:p>
-      <w:pPr>
-        <w:spacing w:line="240" w:lineRule="auto"/>
-        <w:jc w:val="both"/>
-        <w:rPr>
-          <w:rFonts w:ascii="Calibri" w:hAnsi="Calibri" w:cs="Calibri"/>
-          <w:sz w:val="24"/>
-          <w:szCs w:val="24"/>
-          <w:lang w:val="es-CO"/>
-        </w:rPr>
-      </w:pPr>
-      <w:r>
-        <w:rPr>
-          <w:rFonts w:ascii="Calibri" w:hAnsi="Calibri" w:cs="Calibri"/>
-          <w:sz w:val="24"/>
-          <w:szCs w:val="24"/>
-          <w:lang w:val="es-CO"/>
-        </w:rPr>
-        <w:t>El Publicista en construcción de marca: está en capacidad de generar y plantear procesos de innovación de las marcas en momentos de persuasión y posicionamiento de las organizaciones y de las diferentes dinámicas de la sociedad. Reconoce la importancia de la marca como activo principal de una organización, diseña y planifica estrategias para el manejo de las relaciones de marca-consumidor-ciudadano, de tal manera que se incremente el bienestar de la sociedad.</w:t>
-      </w:r>
-    </w:p>
-    <w:p>
-      <w:pPr>
-        <w:spacing w:line="240" w:lineRule="auto"/>
-        <w:jc w:val="both"/>
-        <w:rPr>
-          <w:rFonts w:ascii="Calibri" w:hAnsi="Calibri" w:cs="Calibri"/>
-          <w:sz w:val="24"/>
-          <w:szCs w:val="24"/>
-          <w:lang w:val="es-CO"/>
-        </w:rPr>
-      </w:pPr>
-      <w:r>
-        <w:rPr>
-          <w:rFonts w:ascii="Calibri" w:hAnsi="Calibri" w:cs="Calibri"/>
-          <w:sz w:val="24"/>
-          <w:szCs w:val="24"/>
-          <w:lang w:val="es-CO"/>
-        </w:rPr>
-        <w:t>El Publicista Investigador: es un sujeto crítico que comprende y confronta el contexto dentro del cual se desempeña, sabe plantearse preguntas y apropiarse de los diferentes enfoques y tendencias en investigación publicitaria, de conceptos y técnicas que permiten detectar las necesidades y problemáticas de la sociedad y de las personas en su papel de ciudadanos-consumidores, apoyándose en los conocimientos de las ciencias sociales y humanas. </w:t>
-      </w:r>
-    </w:p>
-    <w:p>
-      <w:pPr>
-        <w:spacing w:line="240" w:lineRule="auto"/>
-        <w:jc w:val="both"/>
-        <w:rPr>
-          <w:rFonts w:ascii="Calibri" w:hAnsi="Calibri" w:cs="Calibri"/>
-          <w:sz w:val="24"/>
-          <w:szCs w:val="24"/>
-          <w:lang w:val="es-CO"/>
-        </w:rPr>
-      </w:pPr>
-    </w:p>
-    <w:p>
-      <w:pPr>
-        <w:spacing w:line="240" w:lineRule="auto"/>
-        <w:jc w:val="both"/>
-        <w:rPr>
-          <w:rFonts w:ascii="Calibri" w:hAnsi="Calibri" w:cs="Calibri"/>
-          <w:b/>
-          <w:bCs/>
-          <w:sz w:val="24"/>
-          <w:szCs w:val="24"/>
-          <w:lang w:val="es-CO"/>
-        </w:rPr>
-      </w:pPr>
-      <w:r>
-        <w:rPr>
-          <w:rFonts w:ascii="Calibri" w:hAnsi="Calibri" w:cs="Calibri"/>
-          <w:b/>
-          <w:bCs/>
-          <w:sz w:val="24"/>
-          <w:szCs w:val="24"/>
-          <w:lang w:val="es-CO"/>
-        </w:rPr>
-        <w:t xml:space="preserve">PERFIL DEL EGRESADO DE </w:t>
-      </w:r>
-      <w:r>
-        <w:rPr>
-          <w:rFonts w:ascii="Calibri" w:hAnsi="Calibri" w:cs="Calibri"/>
-          <w:b/>
-          <w:bCs/>
-          <w:sz w:val="24"/>
-          <w:szCs w:val="24"/>
-          <w:lang w:val="es-CO"/>
-        </w:rPr>
-        <w:t>COMUNICACIÓN SOCIAL</w:t>
-      </w:r>
-    </w:p>
-    <w:p>
-      <w:pPr>
-        <w:spacing w:line="240" w:lineRule="auto"/>
-        <w:jc w:val="both"/>
-        <w:rPr>
-          <w:rFonts w:ascii="Calibri" w:hAnsi="Calibri" w:cs="Calibri"/>
-          <w:sz w:val="24"/>
-          <w:szCs w:val="24"/>
-          <w:lang w:val="es-CO"/>
-        </w:rPr>
-      </w:pPr>
-      <w:r>
-        <w:rPr>
-          <w:rFonts w:ascii="Calibri" w:hAnsi="Calibri" w:cs="Calibri"/>
-          <w:sz w:val="24"/>
-          <w:szCs w:val="24"/>
-          <w:lang w:val="es-CO"/>
-        </w:rPr>
-        <w:t>El Comunicador Social santiaguino tendrá el siguiente perfil profesional en términos de competencias:</w:t>
-      </w:r>
-    </w:p>
-    <w:p>
-      <w:pPr>
-        <w:numPr>
-          <w:ilvl w:val="0"/>
-          <w:numId w:val="22"/>
-        </w:numPr>
-        <w:spacing w:line="240" w:lineRule="auto"/>
-        <w:jc w:val="both"/>
-        <w:rPr>
-          <w:rFonts w:ascii="Calibri" w:hAnsi="Calibri" w:cs="Calibri"/>
-          <w:sz w:val="24"/>
-          <w:szCs w:val="24"/>
-          <w:lang w:val="es-CO"/>
-        </w:rPr>
-      </w:pPr>
-      <w:r>
-        <w:rPr>
-          <w:rFonts w:ascii="Calibri" w:hAnsi="Calibri" w:cs="Calibri"/>
-          <w:sz w:val="24"/>
-          <w:szCs w:val="24"/>
-          <w:lang w:val="es-CO"/>
-        </w:rPr>
-        <w:t>Comunicador social productor de contenidos multimediales y periodísticos:       </w:t>
-      </w:r>
-    </w:p>
-    <w:p>
-      <w:pPr>
-        <w:spacing w:line="240" w:lineRule="auto"/>
-        <w:jc w:val="both"/>
-        <w:rPr>
-          <w:rFonts w:ascii="Calibri" w:hAnsi="Calibri" w:cs="Calibri"/>
-          <w:sz w:val="24"/>
-          <w:szCs w:val="24"/>
-          <w:lang w:val="es-CO"/>
-        </w:rPr>
-      </w:pPr>
-      <w:r>
-        <w:rPr>
-          <w:rFonts w:ascii="Calibri" w:hAnsi="Calibri" w:cs="Calibri"/>
-          <w:sz w:val="24"/>
-          <w:szCs w:val="24"/>
-          <w:lang w:val="es-CO"/>
-        </w:rPr>
-        <w:t>Es un sujeto crítico que sabe interpretar procesos comunicativos contextualizados, sabe identificar las representaciones, y simbolizaciones necesarias, sabe elaborar piezas comunicativas y periodísticas contextualizadas.</w:t>
-      </w:r>
-    </w:p>
-    <w:p>
-      <w:pPr>
-        <w:numPr>
-          <w:ilvl w:val="0"/>
-          <w:numId w:val="23"/>
-        </w:numPr>
-        <w:spacing w:line="240" w:lineRule="auto"/>
-        <w:jc w:val="both"/>
-        <w:rPr>
-          <w:rFonts w:ascii="Calibri" w:hAnsi="Calibri" w:cs="Calibri"/>
-          <w:sz w:val="24"/>
-          <w:szCs w:val="24"/>
-          <w:lang w:val="es-CO"/>
-        </w:rPr>
-      </w:pPr>
-      <w:r>
-        <w:rPr>
-          <w:rFonts w:ascii="Calibri" w:hAnsi="Calibri" w:cs="Calibri"/>
-          <w:sz w:val="24"/>
-          <w:szCs w:val="24"/>
-          <w:lang w:val="es-CO"/>
-        </w:rPr>
-        <w:t>El comunicador social gestor de la comunicación de las organizaciones:         </w:t>
-      </w:r>
-    </w:p>
-    <w:p>
-      <w:pPr>
-        <w:spacing w:line="240" w:lineRule="auto"/>
-        <w:jc w:val="both"/>
-        <w:rPr>
-          <w:rFonts w:ascii="Calibri" w:hAnsi="Calibri" w:cs="Calibri"/>
-          <w:sz w:val="24"/>
-          <w:szCs w:val="24"/>
-          <w:lang w:val="es-CO"/>
-        </w:rPr>
-      </w:pPr>
-      <w:r>
-        <w:rPr>
-          <w:rFonts w:ascii="Calibri" w:hAnsi="Calibri" w:cs="Calibri"/>
-          <w:sz w:val="24"/>
-          <w:szCs w:val="24"/>
-          <w:lang w:val="es-CO"/>
-        </w:rPr>
-        <w:lastRenderedPageBreak/>
-        <w:t>Es un sujeto crítico que sabe interpretar críticamente procesos organizativos dentro de un contexto, sabe reconocer las estrategias comunicativas pertinentes, sabe elaborar y ejecutar proyectos comunicativos contextualizados para organizaciones de diverso tipo.  </w:t>
-      </w:r>
-    </w:p>
-    <w:p>
-      <w:pPr>
-        <w:numPr>
-          <w:ilvl w:val="0"/>
-          <w:numId w:val="24"/>
-        </w:numPr>
-        <w:spacing w:line="240" w:lineRule="auto"/>
-        <w:jc w:val="both"/>
-        <w:rPr>
-          <w:rFonts w:ascii="Calibri" w:hAnsi="Calibri" w:cs="Calibri"/>
-          <w:sz w:val="24"/>
-          <w:szCs w:val="24"/>
-          <w:lang w:val="es-CO"/>
-        </w:rPr>
-      </w:pPr>
-      <w:r>
-        <w:rPr>
-          <w:rFonts w:ascii="Calibri" w:hAnsi="Calibri" w:cs="Calibri"/>
-          <w:sz w:val="24"/>
-          <w:szCs w:val="24"/>
-          <w:lang w:val="es-CO"/>
-        </w:rPr>
-        <w:t>El comunicador social gestor de procesos de investigador:</w:t>
-      </w:r>
-    </w:p>
-    <w:p>
-      <w:pPr>
-        <w:spacing w:line="240" w:lineRule="auto"/>
-        <w:jc w:val="both"/>
-        <w:rPr>
-          <w:rFonts w:ascii="Calibri" w:hAnsi="Calibri" w:cs="Calibri"/>
-          <w:b/>
-          <w:bCs/>
-          <w:sz w:val="24"/>
-          <w:szCs w:val="24"/>
-          <w:lang w:val="es-CO"/>
-        </w:rPr>
-      </w:pPr>
-      <w:r>
-        <w:rPr>
-          <w:rFonts w:ascii="Calibri" w:hAnsi="Calibri" w:cs="Calibri"/>
-          <w:sz w:val="24"/>
-          <w:szCs w:val="24"/>
-          <w:lang w:val="es-CO"/>
-        </w:rPr>
-        <w:t>Es un sujeto crítico que sabe problematizar la realidad sociocultural dentro de un contexto identificando la perspectiva y las herramientas metodológicas más adecuadas para proponer alternativas de solución desde el campo comunicacional, apropiándose de los diferentes enfoques y tendencias de investigación.</w:t>
-      </w:r>
-    </w:p>
-    <w:p>
-      <w:pPr>
-        <w:spacing w:line="240" w:lineRule="auto"/>
-        <w:jc w:val="both"/>
-        <w:rPr>
-          <w:rFonts w:ascii="Calibri" w:hAnsi="Calibri" w:cs="Calibri"/>
-          <w:b/>
-          <w:bCs/>
-          <w:sz w:val="24"/>
-          <w:szCs w:val="24"/>
-          <w:lang w:val="es-CO"/>
-        </w:rPr>
-      </w:pPr>
-    </w:p>
-    <w:p>
-      <w:pPr>
-        <w:spacing w:line="240" w:lineRule="auto"/>
-        <w:jc w:val="both"/>
-        <w:rPr>
-          <w:rFonts w:ascii="Calibri" w:hAnsi="Calibri" w:cs="Calibri"/>
-          <w:sz w:val="24"/>
-          <w:szCs w:val="24"/>
-          <w:lang w:val="es-CO"/>
-        </w:rPr>
-      </w:pPr>
-      <w:r>
-        <w:rPr>
-          <w:rFonts w:ascii="Calibri" w:hAnsi="Calibri" w:cs="Calibri"/>
-          <w:sz w:val="24"/>
-          <w:szCs w:val="24"/>
-          <w:lang w:val="es-CO"/>
-        </w:rPr>
-        <w:t xml:space="preserve">Fuente: </w:t>
-      </w:r>
-      <w:r>
-        <w:rPr>
-          <w:rFonts w:ascii="Calibri" w:hAnsi="Calibri" w:cs="Calibri"/>
-          <w:sz w:val="24"/>
-          <w:szCs w:val="24"/>
-          <w:lang w:val="es-CO"/>
-        </w:rPr>
-        <w:t>https://www.usc.edu.co</w:t>
-      </w:r>
-    </w:p>
     <w:sectPr>
       <w:headerReference w:type="default" r:id="rId8"/>
       <w:footerReference w:type="default" r:id="rId9"/>
@@ -1180,7 +755,7 @@
 </file>
 
 <file path=word/endnotes.xml><?xml version="1.0" encoding="utf-8"?>
-<w:endnotes xmlns:wpc="http://schemas.microsoft.com/office/word/2010/wordprocessingCanvas" xmlns:cx="http://schemas.microsoft.com/office/drawing/2014/chartex" xmlns:cx1="http://schemas.microsoft.com/office/drawing/2015/9/8/chartex" xmlns:cx2="http://schemas.microsoft.com/office/drawing/2015/10/21/chartex" xmlns:cx3="http://schemas.microsoft.com/office/drawing/2016/5/9/chartex" xmlns:cx4="http://schemas.microsoft.com/office/drawing/2016/5/10/chartex" xmlns:cx5="http://schemas.microsoft.com/office/drawing/2016/5/11/chartex" xmlns:cx6="http://schemas.microsoft.com/office/drawing/2016/5/12/chartex" xmlns:cx7="http://schemas.microsoft.com/office/drawing/2016/5/13/chartex" xmlns:cx8="http://schemas.microsoft.com/office/drawing/2016/5/14/chartex" xmlns:mc="http://schemas.openxmlformats.org/markup-compatibility/2006" xmlns:aink="http://schemas.microsoft.com/office/drawing/2016/ink" xmlns:am3d="http://schemas.microsoft.com/office/drawing/2017/model3d" xmlns:o="urn:schemas-microsoft-com:office:office" xmlns:oel="http://schemas.microsoft.com/office/2019/extlst" xmlns:r="http://schemas.openxmlformats.org/officeDocument/2006/relationships" xmlns:m="http://schemas.openxmlformats.org/officeDocument/2006/math" xmlns:v="urn:schemas-microsoft-com:vml" xmlns:wp14="http://schemas.microsoft.com/office/word/2010/wordprocessingDrawing" xmlns:wp="http://schemas.openxmlformats.org/drawingml/2006/wordprocessingDrawing" xmlns:w10="urn:schemas-microsoft-com:office:word" xmlns:w="http://schemas.openxmlformats.org/wordprocessingml/2006/main" xmlns:w14="http://schemas.microsoft.com/office/word/2010/wordml" xmlns:w15="http://schemas.microsoft.com/office/word/2012/wordml" xmlns:w16cei="http://schemas.microsoft.com/office/word/2026/wordml/cei" xmlns:w16cex="http://schemas.microsoft.com/office/word/2018/wordml/cex" xmlns:w16cid="http://schemas.microsoft.com/office/word/2016/wordml/cid" xmlns:w16="http://schemas.microsoft.com/office/word/2018/wordml" xmlns:w16du="http://schemas.microsoft.com/office/word/2023/wordml/word16du" xmlns:w16sdtdh="http://schemas.microsoft.com/office/word/2020/wordml/sdtdatahash" xmlns:w16sdtfl="http://schemas.microsoft.com/office/word/2024/wordml/sdtformatlock" xmlns:w16se="http://schemas.microsoft.com/office/word/2015/wordml/symex" xmlns:wpg="http://schemas.microsoft.com/office/word/2010/wordprocessingGroup" xmlns:wpi="http://schemas.microsoft.com/office/word/2010/wordprocessingInk" xmlns:wne="http://schemas.microsoft.com/office/word/2006/wordml" xmlns:wps="http://schemas.microsoft.com/office/word/2010/wordprocessingShape" mc:Ignorable="w14 w15 w16se w16cid w16 w16cex w16sdtdh w16sdtfl w16du wp14">
+<w:endnotes xmlns:wpc="http://schemas.microsoft.com/office/word/2010/wordprocessingCanvas" xmlns:cx="http://schemas.microsoft.com/office/drawing/2014/chartex" xmlns:cx1="http://schemas.microsoft.com/office/drawing/2015/9/8/chartex" xmlns:cx2="http://schemas.microsoft.com/office/drawing/2015/10/21/chartex" xmlns:cx3="http://schemas.microsoft.com/office/drawing/2016/5/9/chartex" xmlns:cx4="http://schemas.microsoft.com/office/drawing/2016/5/10/chartex" xmlns:cx5="http://schemas.microsoft.com/office/drawing/2016/5/11/chartex" xmlns:cx6="http://schemas.microsoft.com/office/drawing/2016/5/12/chartex" xmlns:cx7="http://schemas.microsoft.com/office/drawing/2016/5/13/chartex" xmlns:cx8="http://schemas.microsoft.com/office/drawing/2016/5/14/chartex" xmlns:mc="http://schemas.openxmlformats.org/markup-compatibility/2006" xmlns:aink="http://schemas.microsoft.com/office/drawing/2016/ink" xmlns:am3d="http://schemas.microsoft.com/office/drawing/2017/model3d" xmlns:o="urn:schemas-microsoft-com:office:office" xmlns:oel="http://schemas.microsoft.com/office/2019/extlst" xmlns:r="http://schemas.openxmlformats.org/officeDocument/2006/relationships" xmlns:m="http://schemas.openxmlformats.org/officeDocument/2006/math" xmlns:v="urn:schemas-microsoft-com:vml" xmlns:wp14="http://schemas.microsoft.com/office/word/2010/wordprocessingDrawing" xmlns:wp="http://schemas.openxmlformats.org/drawingml/2006/wordprocessingDrawing" xmlns:w10="urn:schemas-microsoft-com:office:word" xmlns:w="http://schemas.openxmlformats.org/wordprocessingml/2006/main" xmlns:w14="http://schemas.microsoft.com/office/word/2010/wordml" xmlns:w15="http://schemas.microsoft.com/office/word/2012/wordml" xmlns:w16cex="http://schemas.microsoft.com/office/word/2018/wordml/cex" xmlns:w16cid="http://schemas.microsoft.com/office/word/2016/wordml/cid" xmlns:w16="http://schemas.microsoft.com/office/word/2018/wordml" xmlns:w16du="http://schemas.microsoft.com/office/word/2023/wordml/word16du" xmlns:w16sdtdh="http://schemas.microsoft.com/office/word/2020/wordml/sdtdatahash" xmlns:w16sdtfl="http://schemas.microsoft.com/office/word/2024/wordml/sdtformatlock" xmlns:w16se="http://schemas.microsoft.com/office/word/2015/wordml/symex" xmlns:wpg="http://schemas.microsoft.com/office/word/2010/wordprocessingGroup" xmlns:wpi="http://schemas.microsoft.com/office/word/2010/wordprocessingInk" xmlns:wne="http://schemas.microsoft.com/office/word/2006/wordml" xmlns:wps="http://schemas.microsoft.com/office/word/2010/wordprocessingShape" mc:Ignorable="w14 w15 w16se w16cid w16 w16cex w16sdtdh w16sdtfl w16du wp14">
   <w:endnote w:type="separator" w:id="-1">
     <w:p>
       <w:pPr>
@@ -1205,7 +780,7 @@
 </file>
 
 <file path=word/footer1.xml><?xml version="1.0" encoding="utf-8"?>
-<w:ftr xmlns:wpc="http://schemas.microsoft.com/office/word/2010/wordprocessingCanvas" xmlns:cx="http://schemas.microsoft.com/office/drawing/2014/chartex" xmlns:cx1="http://schemas.microsoft.com/office/drawing/2015/9/8/chartex" xmlns:cx2="http://schemas.microsoft.com/office/drawing/2015/10/21/chartex" xmlns:cx3="http://schemas.microsoft.com/office/drawing/2016/5/9/chartex" xmlns:cx4="http://schemas.microsoft.com/office/drawing/2016/5/10/chartex" xmlns:cx5="http://schemas.microsoft.com/office/drawing/2016/5/11/chartex" xmlns:cx6="http://schemas.microsoft.com/office/drawing/2016/5/12/chartex" xmlns:cx7="http://schemas.microsoft.com/office/drawing/2016/5/13/chartex" xmlns:cx8="http://schemas.microsoft.com/office/drawing/2016/5/14/chartex" xmlns:mc="http://schemas.openxmlformats.org/markup-compatibility/2006" xmlns:aink="http://schemas.microsoft.com/office/drawing/2016/ink" xmlns:am3d="http://schemas.microsoft.com/office/drawing/2017/model3d" xmlns:o="urn:schemas-microsoft-com:office:office" xmlns:oel="http://schemas.microsoft.com/office/2019/extlst" xmlns:r="http://schemas.openxmlformats.org/officeDocument/2006/relationships" xmlns:m="http://schemas.openxmlformats.org/officeDocument/2006/math" xmlns:v="urn:schemas-microsoft-com:vml" xmlns:wp14="http://schemas.microsoft.com/office/word/2010/wordprocessingDrawing" xmlns:wp="http://schemas.openxmlformats.org/drawingml/2006/wordprocessingDrawing" xmlns:w10="urn:schemas-microsoft-com:office:word" xmlns:w="http://schemas.openxmlformats.org/wordprocessingml/2006/main" xmlns:w14="http://schemas.microsoft.com/office/word/2010/wordml" xmlns:w15="http://schemas.microsoft.com/office/word/2012/wordml" xmlns:w16cei="http://schemas.microsoft.com/office/word/2026/wordml/cei" xmlns:w16cex="http://schemas.microsoft.com/office/word/2018/wordml/cex" xmlns:w16cid="http://schemas.microsoft.com/office/word/2016/wordml/cid" xmlns:w16="http://schemas.microsoft.com/office/word/2018/wordml" xmlns:w16du="http://schemas.microsoft.com/office/word/2023/wordml/word16du" xmlns:w16sdtdh="http://schemas.microsoft.com/office/word/2020/wordml/sdtdatahash" xmlns:w16sdtfl="http://schemas.microsoft.com/office/word/2024/wordml/sdtformatlock" xmlns:w16se="http://schemas.microsoft.com/office/word/2015/wordml/symex" xmlns:wpg="http://schemas.microsoft.com/office/word/2010/wordprocessingGroup" xmlns:wpi="http://schemas.microsoft.com/office/word/2010/wordprocessingInk" xmlns:wne="http://schemas.microsoft.com/office/word/2006/wordml" xmlns:wps="http://schemas.microsoft.com/office/word/2010/wordprocessingShape" mc:Ignorable="w14 w15 w16se w16cid w16 w16cex w16sdtdh w16sdtfl w16du wp14">
+<w:ftr xmlns:wpc="http://schemas.microsoft.com/office/word/2010/wordprocessingCanvas" xmlns:cx="http://schemas.microsoft.com/office/drawing/2014/chartex" xmlns:cx1="http://schemas.microsoft.com/office/drawing/2015/9/8/chartex" xmlns:cx2="http://schemas.microsoft.com/office/drawing/2015/10/21/chartex" xmlns:cx3="http://schemas.microsoft.com/office/drawing/2016/5/9/chartex" xmlns:cx4="http://schemas.microsoft.com/office/drawing/2016/5/10/chartex" xmlns:cx5="http://schemas.microsoft.com/office/drawing/2016/5/11/chartex" xmlns:cx6="http://schemas.microsoft.com/office/drawing/2016/5/12/chartex" xmlns:cx7="http://schemas.microsoft.com/office/drawing/2016/5/13/chartex" xmlns:cx8="http://schemas.microsoft.com/office/drawing/2016/5/14/chartex" xmlns:mc="http://schemas.openxmlformats.org/markup-compatibility/2006" xmlns:aink="http://schemas.microsoft.com/office/drawing/2016/ink" xmlns:am3d="http://schemas.microsoft.com/office/drawing/2017/model3d" xmlns:o="urn:schemas-microsoft-com:office:office" xmlns:oel="http://schemas.microsoft.com/office/2019/extlst" xmlns:r="http://schemas.openxmlformats.org/officeDocument/2006/relationships" xmlns:m="http://schemas.openxmlformats.org/officeDocument/2006/math" xmlns:v="urn:schemas-microsoft-com:vml" xmlns:wp14="http://schemas.microsoft.com/office/word/2010/wordprocessingDrawing" xmlns:wp="http://schemas.openxmlformats.org/drawingml/2006/wordprocessingDrawing" xmlns:w10="urn:schemas-microsoft-com:office:word" xmlns:w="http://schemas.openxmlformats.org/wordprocessingml/2006/main" xmlns:w14="http://schemas.microsoft.com/office/word/2010/wordml" xmlns:w15="http://schemas.microsoft.com/office/word/2012/wordml" xmlns:w16cex="http://schemas.microsoft.com/office/word/2018/wordml/cex" xmlns:w16cid="http://schemas.microsoft.com/office/word/2016/wordml/cid" xmlns:w16="http://schemas.microsoft.com/office/word/2018/wordml" xmlns:w16du="http://schemas.microsoft.com/office/word/2023/wordml/word16du" xmlns:w16sdtdh="http://schemas.microsoft.com/office/word/2020/wordml/sdtdatahash" xmlns:w16sdtfl="http://schemas.microsoft.com/office/word/2024/wordml/sdtformatlock" xmlns:w16se="http://schemas.microsoft.com/office/word/2015/wordml/symex" xmlns:wpg="http://schemas.microsoft.com/office/word/2010/wordprocessingGroup" xmlns:wpi="http://schemas.microsoft.com/office/word/2010/wordprocessingInk" xmlns:wne="http://schemas.microsoft.com/office/word/2006/wordml" xmlns:wps="http://schemas.microsoft.com/office/word/2010/wordprocessingShape" mc:Ignorable="w14 w15 w16se w16cid w16 w16cex w16sdtdh w16sdtfl w16du wp14">
   <w:p>
     <w:pPr>
       <w:pStyle w:val="Piedepgina"/>
@@ -1283,7 +858,7 @@
 </file>
 
 <file path=word/footnotes.xml><?xml version="1.0" encoding="utf-8"?>
-<w:footnotes xmlns:wpc="http://schemas.microsoft.com/office/word/2010/wordprocessingCanvas" xmlns:cx="http://schemas.microsoft.com/office/drawing/2014/chartex" xmlns:cx1="http://schemas.microsoft.com/office/drawing/2015/9/8/chartex" xmlns:cx2="http://schemas.microsoft.com/office/drawing/2015/10/21/chartex" xmlns:cx3="http://schemas.microsoft.com/office/drawing/2016/5/9/chartex" xmlns:cx4="http://schemas.microsoft.com/office/drawing/2016/5/10/chartex" xmlns:cx5="http://schemas.microsoft.com/office/drawing/2016/5/11/chartex" xmlns:cx6="http://schemas.microsoft.com/office/drawing/2016/5/12/chartex" xmlns:cx7="http://schemas.microsoft.com/office/drawing/2016/5/13/chartex" xmlns:cx8="http://schemas.microsoft.com/office/drawing/2016/5/14/chartex" xmlns:mc="http://schemas.openxmlformats.org/markup-compatibility/2006" xmlns:aink="http://schemas.microsoft.com/office/drawing/2016/ink" xmlns:am3d="http://schemas.microsoft.com/office/drawing/2017/model3d" xmlns:o="urn:schemas-microsoft-com:office:office" xmlns:oel="http://schemas.microsoft.com/office/2019/extlst" xmlns:r="http://schemas.openxmlformats.org/officeDocument/2006/relationships" xmlns:m="http://schemas.openxmlformats.org/officeDocument/2006/math" xmlns:v="urn:schemas-microsoft-com:vml" xmlns:wp14="http://schemas.microsoft.com/office/word/2010/wordprocessingDrawing" xmlns:wp="http://schemas.openxmlformats.org/drawingml/2006/wordprocessingDrawing" xmlns:w10="urn:schemas-microsoft-com:office:word" xmlns:w="http://schemas.openxmlformats.org/wordprocessingml/2006/main" xmlns:w14="http://schemas.microsoft.com/office/word/2010/wordml" xmlns:w15="http://schemas.microsoft.com/office/word/2012/wordml" xmlns:w16cei="http://schemas.microsoft.com/office/word/2026/wordml/cei" xmlns:w16cex="http://schemas.microsoft.com/office/word/2018/wordml/cex" xmlns:w16cid="http://schemas.microsoft.com/office/word/2016/wordml/cid" xmlns:w16="http://schemas.microsoft.com/office/word/2018/wordml" xmlns:w16du="http://schemas.microsoft.com/office/word/2023/wordml/word16du" xmlns:w16sdtdh="http://schemas.microsoft.com/office/word/2020/wordml/sdtdatahash" xmlns:w16sdtfl="http://schemas.microsoft.com/office/word/2024/wordml/sdtformatlock" xmlns:w16se="http://schemas.microsoft.com/office/word/2015/wordml/symex" xmlns:wpg="http://schemas.microsoft.com/office/word/2010/wordprocessingGroup" xmlns:wpi="http://schemas.microsoft.com/office/word/2010/wordprocessingInk" xmlns:wne="http://schemas.microsoft.com/office/word/2006/wordml" xmlns:wps="http://schemas.microsoft.com/office/word/2010/wordprocessingShape" mc:Ignorable="w14 w15 w16se w16cid w16 w16cex w16sdtdh w16sdtfl w16du wp14">
+<w:footnotes xmlns:wpc="http://schemas.microsoft.com/office/word/2010/wordprocessingCanvas" xmlns:cx="http://schemas.microsoft.com/office/drawing/2014/chartex" xmlns:cx1="http://schemas.microsoft.com/office/drawing/2015/9/8/chartex" xmlns:cx2="http://schemas.microsoft.com/office/drawing/2015/10/21/chartex" xmlns:cx3="http://schemas.microsoft.com/office/drawing/2016/5/9/chartex" xmlns:cx4="http://schemas.microsoft.com/office/drawing/2016/5/10/chartex" xmlns:cx5="http://schemas.microsoft.com/office/drawing/2016/5/11/chartex" xmlns:cx6="http://schemas.microsoft.com/office/drawing/2016/5/12/chartex" xmlns:cx7="http://schemas.microsoft.com/office/drawing/2016/5/13/chartex" xmlns:cx8="http://schemas.microsoft.com/office/drawing/2016/5/14/chartex" xmlns:mc="http://schemas.openxmlformats.org/markup-compatibility/2006" xmlns:aink="http://schemas.microsoft.com/office/drawing/2016/ink" xmlns:am3d="http://schemas.microsoft.com/office/drawing/2017/model3d" xmlns:o="urn:schemas-microsoft-com:office:office" xmlns:oel="http://schemas.microsoft.com/office/2019/extlst" xmlns:r="http://schemas.openxmlformats.org/officeDocument/2006/relationships" xmlns:m="http://schemas.openxmlformats.org/officeDocument/2006/math" xmlns:v="urn:schemas-microsoft-com:vml" xmlns:wp14="http://schemas.microsoft.com/office/word/2010/wordprocessingDrawing" xmlns:wp="http://schemas.openxmlformats.org/drawingml/2006/wordprocessingDrawing" xmlns:w10="urn:schemas-microsoft-com:office:word" xmlns:w="http://schemas.openxmlformats.org/wordprocessingml/2006/main" xmlns:w14="http://schemas.microsoft.com/office/word/2010/wordml" xmlns:w15="http://schemas.microsoft.com/office/word/2012/wordml" xmlns:w16cex="http://schemas.microsoft.com/office/word/2018/wordml/cex" xmlns:w16cid="http://schemas.microsoft.com/office/word/2016/wordml/cid" xmlns:w16="http://schemas.microsoft.com/office/word/2018/wordml" xmlns:w16du="http://schemas.microsoft.com/office/word/2023/wordml/word16du" xmlns:w16sdtdh="http://schemas.microsoft.com/office/word/2020/wordml/sdtdatahash" xmlns:w16sdtfl="http://schemas.microsoft.com/office/word/2024/wordml/sdtformatlock" xmlns:w16se="http://schemas.microsoft.com/office/word/2015/wordml/symex" xmlns:wpg="http://schemas.microsoft.com/office/word/2010/wordprocessingGroup" xmlns:wpi="http://schemas.microsoft.com/office/word/2010/wordprocessingInk" xmlns:wne="http://schemas.microsoft.com/office/word/2006/wordml" xmlns:wps="http://schemas.microsoft.com/office/word/2010/wordprocessingShape" mc:Ignorable="w14 w15 w16se w16cid w16 w16cex w16sdtdh w16sdtfl w16du wp14">
   <w:footnote w:type="separator" w:id="-1">
     <w:p>
       <w:pPr>
@@ -1308,7 +883,7 @@
 </file>
 
 <file path=word/header1.xml><?xml version="1.0" encoding="utf-8"?>
-<w:hdr xmlns:wpc="http://schemas.microsoft.com/office/word/2010/wordprocessingCanvas" xmlns:cx="http://schemas.microsoft.com/office/drawing/2014/chartex" xmlns:cx1="http://schemas.microsoft.com/office/drawing/2015/9/8/chartex" xmlns:cx2="http://schemas.microsoft.com/office/drawing/2015/10/21/chartex" xmlns:cx3="http://schemas.microsoft.com/office/drawing/2016/5/9/chartex" xmlns:cx4="http://schemas.microsoft.com/office/drawing/2016/5/10/chartex" xmlns:cx5="http://schemas.microsoft.com/office/drawing/2016/5/11/chartex" xmlns:cx6="http://schemas.microsoft.com/office/drawing/2016/5/12/chartex" xmlns:cx7="http://schemas.microsoft.com/office/drawing/2016/5/13/chartex" xmlns:cx8="http://schemas.microsoft.com/office/drawing/2016/5/14/chartex" xmlns:mc="http://schemas.openxmlformats.org/markup-compatibility/2006" xmlns:aink="http://schemas.microsoft.com/office/drawing/2016/ink" xmlns:am3d="http://schemas.microsoft.com/office/drawing/2017/model3d" xmlns:o="urn:schemas-microsoft-com:office:office" xmlns:oel="http://schemas.microsoft.com/office/2019/extlst" xmlns:r="http://schemas.openxmlformats.org/officeDocument/2006/relationships" xmlns:m="http://schemas.openxmlformats.org/officeDocument/2006/math" xmlns:v="urn:schemas-microsoft-com:vml" xmlns:wp14="http://schemas.microsoft.com/office/word/2010/wordprocessingDrawing" xmlns:wp="http://schemas.openxmlformats.org/drawingml/2006/wordprocessingDrawing" xmlns:w10="urn:schemas-microsoft-com:office:word" xmlns:w="http://schemas.openxmlformats.org/wordprocessingml/2006/main" xmlns:w14="http://schemas.microsoft.com/office/word/2010/wordml" xmlns:w15="http://schemas.microsoft.com/office/word/2012/wordml" xmlns:w16cei="http://schemas.microsoft.com/office/word/2026/wordml/cei" xmlns:w16cex="http://schemas.microsoft.com/office/word/2018/wordml/cex" xmlns:w16cid="http://schemas.microsoft.com/office/word/2016/wordml/cid" xmlns:w16="http://schemas.microsoft.com/office/word/2018/wordml" xmlns:w16du="http://schemas.microsoft.com/office/word/2023/wordml/word16du" xmlns:w16sdtdh="http://schemas.microsoft.com/office/word/2020/wordml/sdtdatahash" xmlns:w16sdtfl="http://schemas.microsoft.com/office/word/2024/wordml/sdtformatlock" xmlns:w16se="http://schemas.microsoft.com/office/word/2015/wordml/symex" xmlns:wpg="http://schemas.microsoft.com/office/word/2010/wordprocessingGroup" xmlns:wpi="http://schemas.microsoft.com/office/word/2010/wordprocessingInk" xmlns:wne="http://schemas.microsoft.com/office/word/2006/wordml" xmlns:wps="http://schemas.microsoft.com/office/word/2010/wordprocessingShape" mc:Ignorable="w14 w15 w16se w16cid w16 w16cex w16sdtdh w16sdtfl w16du wp14">
+<w:hdr xmlns:wpc="http://schemas.microsoft.com/office/word/2010/wordprocessingCanvas" xmlns:cx="http://schemas.microsoft.com/office/drawing/2014/chartex" xmlns:cx1="http://schemas.microsoft.com/office/drawing/2015/9/8/chartex" xmlns:cx2="http://schemas.microsoft.com/office/drawing/2015/10/21/chartex" xmlns:cx3="http://schemas.microsoft.com/office/drawing/2016/5/9/chartex" xmlns:cx4="http://schemas.microsoft.com/office/drawing/2016/5/10/chartex" xmlns:cx5="http://schemas.microsoft.com/office/drawing/2016/5/11/chartex" xmlns:cx6="http://schemas.microsoft.com/office/drawing/2016/5/12/chartex" xmlns:cx7="http://schemas.microsoft.com/office/drawing/2016/5/13/chartex" xmlns:cx8="http://schemas.microsoft.com/office/drawing/2016/5/14/chartex" xmlns:mc="http://schemas.openxmlformats.org/markup-compatibility/2006" xmlns:aink="http://schemas.microsoft.com/office/drawing/2016/ink" xmlns:am3d="http://schemas.microsoft.com/office/drawing/2017/model3d" xmlns:o="urn:schemas-microsoft-com:office:office" xmlns:oel="http://schemas.microsoft.com/office/2019/extlst" xmlns:r="http://schemas.openxmlformats.org/officeDocument/2006/relationships" xmlns:m="http://schemas.openxmlformats.org/officeDocument/2006/math" xmlns:v="urn:schemas-microsoft-com:vml" xmlns:wp14="http://schemas.microsoft.com/office/word/2010/wordprocessingDrawing" xmlns:wp="http://schemas.openxmlformats.org/drawingml/2006/wordprocessingDrawing" xmlns:w10="urn:schemas-microsoft-com:office:word" xmlns:w="http://schemas.openxmlformats.org/wordprocessingml/2006/main" xmlns:w14="http://schemas.microsoft.com/office/word/2010/wordml" xmlns:w15="http://schemas.microsoft.com/office/word/2012/wordml" xmlns:w16cex="http://schemas.microsoft.com/office/word/2018/wordml/cex" xmlns:w16cid="http://schemas.microsoft.com/office/word/2016/wordml/cid" xmlns:w16="http://schemas.microsoft.com/office/word/2018/wordml" xmlns:w16du="http://schemas.microsoft.com/office/word/2023/wordml/word16du" xmlns:w16sdtdh="http://schemas.microsoft.com/office/word/2020/wordml/sdtdatahash" xmlns:w16sdtfl="http://schemas.microsoft.com/office/word/2024/wordml/sdtformatlock" xmlns:w16se="http://schemas.microsoft.com/office/word/2015/wordml/symex" xmlns:wpg="http://schemas.microsoft.com/office/word/2010/wordprocessingGroup" xmlns:wpi="http://schemas.microsoft.com/office/word/2010/wordprocessingInk" xmlns:wne="http://schemas.microsoft.com/office/word/2006/wordml" xmlns:wps="http://schemas.microsoft.com/office/word/2010/wordprocessingShape" mc:Ignorable="w14 w15 w16se w16cid w16 w16cex w16sdtdh w16sdtfl w16du wp14">
   <w:p>
     <w:pPr>
       <w:pStyle w:val="Encabezado"/>
@@ -1386,7 +961,7 @@
 </file>
 
 <file path=word/numbering.xml><?xml version="1.0" encoding="utf-8"?>
-<w:numbering xmlns:wpc="http://schemas.microsoft.com/office/word/2010/wordprocessingCanvas" xmlns:cx="http://schemas.microsoft.com/office/drawing/2014/chartex" xmlns:cx1="http://schemas.microsoft.com/office/drawing/2015/9/8/chartex" xmlns:cx2="http://schemas.microsoft.com/office/drawing/2015/10/21/chartex" xmlns:cx3="http://schemas.microsoft.com/office/drawing/2016/5/9/chartex" xmlns:cx4="http://schemas.microsoft.com/office/drawing/2016/5/10/chartex" xmlns:cx5="http://schemas.microsoft.com/office/drawing/2016/5/11/chartex" xmlns:cx6="http://schemas.microsoft.com/office/drawing/2016/5/12/chartex" xmlns:cx7="http://schemas.microsoft.com/office/drawing/2016/5/13/chartex" xmlns:cx8="http://schemas.microsoft.com/office/drawing/2016/5/14/chartex" xmlns:mc="http://schemas.openxmlformats.org/markup-compatibility/2006" xmlns:aink="http://schemas.microsoft.com/office/drawing/2016/ink" xmlns:am3d="http://schemas.microsoft.com/office/drawing/2017/model3d" xmlns:o="urn:schemas-microsoft-com:office:office" xmlns:oel="http://schemas.microsoft.com/office/2019/extlst" xmlns:r="http://schemas.openxmlformats.org/officeDocument/2006/relationships" xmlns:m="http://schemas.openxmlformats.org/officeDocument/2006/math" xmlns:v="urn:schemas-microsoft-com:vml" xmlns:wp14="http://schemas.microsoft.com/office/word/2010/wordprocessingDrawing" xmlns:wp="http://schemas.openxmlformats.org/drawingml/2006/wordprocessingDrawing" xmlns:w10="urn:schemas-microsoft-com:office:word" xmlns:w="http://schemas.openxmlformats.org/wordprocessingml/2006/main" xmlns:w14="http://schemas.microsoft.com/office/word/2010/wordml" xmlns:w15="http://schemas.microsoft.com/office/word/2012/wordml" xmlns:w16cei="http://schemas.microsoft.com/office/word/2026/wordml/cei" xmlns:w16cex="http://schemas.microsoft.com/office/word/2018/wordml/cex" xmlns:w16cid="http://schemas.microsoft.com/office/word/2016/wordml/cid" xmlns:w16="http://schemas.microsoft.com/office/word/2018/wordml" xmlns:w16du="http://schemas.microsoft.com/office/word/2023/wordml/word16du" xmlns:w16sdtdh="http://schemas.microsoft.com/office/word/2020/wordml/sdtdatahash" xmlns:w16sdtfl="http://schemas.microsoft.com/office/word/2024/wordml/sdtformatlock" xmlns:w16se="http://schemas.microsoft.com/office/word/2015/wordml/symex" xmlns:wpg="http://schemas.microsoft.com/office/word/2010/wordprocessingGroup" xmlns:wpi="http://schemas.microsoft.com/office/word/2010/wordprocessingInk" xmlns:wne="http://schemas.microsoft.com/office/word/2006/wordml" xmlns:wps="http://schemas.microsoft.com/office/word/2010/wordprocessingShape" mc:Ignorable="w14 w15 w16se w16cid w16 w16cex w16sdtdh w16sdtfl w16du wp14">
+<w:numbering xmlns:wpc="http://schemas.microsoft.com/office/word/2010/wordprocessingCanvas" xmlns:cx="http://schemas.microsoft.com/office/drawing/2014/chartex" xmlns:cx1="http://schemas.microsoft.com/office/drawing/2015/9/8/chartex" xmlns:cx2="http://schemas.microsoft.com/office/drawing/2015/10/21/chartex" xmlns:cx3="http://schemas.microsoft.com/office/drawing/2016/5/9/chartex" xmlns:cx4="http://schemas.microsoft.com/office/drawing/2016/5/10/chartex" xmlns:cx5="http://schemas.microsoft.com/office/drawing/2016/5/11/chartex" xmlns:cx6="http://schemas.microsoft.com/office/drawing/2016/5/12/chartex" xmlns:cx7="http://schemas.microsoft.com/office/drawing/2016/5/13/chartex" xmlns:cx8="http://schemas.microsoft.com/office/drawing/2016/5/14/chartex" xmlns:mc="http://schemas.openxmlformats.org/markup-compatibility/2006" xmlns:aink="http://schemas.microsoft.com/office/drawing/2016/ink" xmlns:am3d="http://schemas.microsoft.com/office/drawing/2017/model3d" xmlns:o="urn:schemas-microsoft-com:office:office" xmlns:oel="http://schemas.microsoft.com/office/2019/extlst" xmlns:r="http://schemas.openxmlformats.org/officeDocument/2006/relationships" xmlns:m="http://schemas.openxmlformats.org/officeDocument/2006/math" xmlns:v="urn:schemas-microsoft-com:vml" xmlns:wp14="http://schemas.microsoft.com/office/word/2010/wordprocessingDrawing" xmlns:wp="http://schemas.openxmlformats.org/drawingml/2006/wordprocessingDrawing" xmlns:w10="urn:schemas-microsoft-com:office:word" xmlns:w="http://schemas.openxmlformats.org/wordprocessingml/2006/main" xmlns:w14="http://schemas.microsoft.com/office/word/2010/wordml" xmlns:w15="http://schemas.microsoft.com/office/word/2012/wordml" xmlns:w16cex="http://schemas.microsoft.com/office/word/2018/wordml/cex" xmlns:w16cid="http://schemas.microsoft.com/office/word/2016/wordml/cid" xmlns:w16="http://schemas.microsoft.com/office/word/2018/wordml" xmlns:w16du="http://schemas.microsoft.com/office/word/2023/wordml/word16du" xmlns:w16sdtdh="http://schemas.microsoft.com/office/word/2020/wordml/sdtdatahash" xmlns:w16sdtfl="http://schemas.microsoft.com/office/word/2024/wordml/sdtformatlock" xmlns:w16se="http://schemas.microsoft.com/office/word/2015/wordml/symex" xmlns:wpg="http://schemas.microsoft.com/office/word/2010/wordprocessingGroup" xmlns:wpi="http://schemas.microsoft.com/office/word/2010/wordprocessingInk" xmlns:wne="http://schemas.microsoft.com/office/word/2006/wordml" xmlns:wps="http://schemas.microsoft.com/office/word/2010/wordprocessingShape" mc:Ignorable="w14 w15 w16se w16cid w16 w16cex w16sdtdh w16sdtfl w16du wp14">
   <w:abstractNum w:abstractNumId="0" w15:restartNumberingAfterBreak="0">
     <w:nsid w:val="FFFFFF7C"/>
     <w:multiLevelType w:val="singleLevel"/>

</xml_diff>